<commit_message>
Complete LMS backend testing
</commit_message>
<xml_diff>
--- a/output.docx
+++ b/output.docx
@@ -58,6 +58,7 @@
           <w:rFonts w:ascii="Times New Roman" w:hAnsi="Times New Roman" w:cs="Times New Roman"/>
           <w:b/>
           <w:bCs/>
+          <w:noProof/>
           <w:sz w:val="44"/>
           <w:szCs w:val="44"/>
         </w:rPr>
@@ -133,6 +134,7 @@
       <w:r>
         <w:rPr>
           <w:rFonts w:ascii="Times New Roman" w:hAnsi="Times New Roman" w:cs="Times New Roman"/>
+          <w:noProof/>
           <w:sz w:val="44"/>
           <w:szCs w:val="44"/>
         </w:rPr>
@@ -197,12 +199,13 @@
       <w:r>
         <w:rPr>
           <w:rFonts w:ascii="Times New Roman" w:hAnsi="Times New Roman" w:cs="Times New Roman"/>
+          <w:noProof/>
           <w:sz w:val="44"/>
           <w:szCs w:val="44"/>
         </w:rPr>
         <w:lastRenderedPageBreak/>
         <w:drawing>
-          <wp:inline distT="0" distB="0" distL="0" distR="0" wp14:anchorId="7D709FAB" wp14:editId="5F0CF81A">
+          <wp:inline distT="0" distB="0" distL="0" distR="0" wp14:anchorId="7D709FAB" wp14:editId="55CE6F61">
             <wp:extent cx="6210300" cy="3589020"/>
             <wp:effectExtent l="0" t="0" r="0" b="0"/>
             <wp:docPr id="1166793563" name="Picture 6"/>
@@ -320,6 +323,7 @@
       <w:r>
         <w:rPr>
           <w:rFonts w:ascii="Times New Roman" w:hAnsi="Times New Roman" w:cs="Times New Roman"/>
+          <w:noProof/>
           <w:sz w:val="44"/>
           <w:szCs w:val="44"/>
         </w:rPr>
@@ -394,6 +398,7 @@
       <w:r>
         <w:rPr>
           <w:rFonts w:ascii="Times New Roman" w:hAnsi="Times New Roman" w:cs="Times New Roman"/>
+          <w:noProof/>
           <w:sz w:val="44"/>
           <w:szCs w:val="44"/>
         </w:rPr>
@@ -458,6 +463,7 @@
       <w:r>
         <w:rPr>
           <w:rFonts w:ascii="Times New Roman" w:hAnsi="Times New Roman" w:cs="Times New Roman"/>
+          <w:noProof/>
           <w:sz w:val="44"/>
           <w:szCs w:val="44"/>
         </w:rPr>
@@ -532,6 +538,7 @@
       <w:r>
         <w:rPr>
           <w:rFonts w:ascii="Times New Roman" w:hAnsi="Times New Roman" w:cs="Times New Roman"/>
+          <w:noProof/>
           <w:sz w:val="44"/>
           <w:szCs w:val="44"/>
         </w:rPr>
@@ -596,6 +603,7 @@
       <w:r>
         <w:rPr>
           <w:rFonts w:ascii="Times New Roman" w:hAnsi="Times New Roman" w:cs="Times New Roman"/>
+          <w:noProof/>
           <w:sz w:val="44"/>
           <w:szCs w:val="44"/>
         </w:rPr>
@@ -728,6 +736,7 @@
       <w:r>
         <w:rPr>
           <w:rFonts w:ascii="Times New Roman" w:hAnsi="Times New Roman" w:cs="Times New Roman"/>
+          <w:noProof/>
           <w:sz w:val="28"/>
           <w:szCs w:val="28"/>
         </w:rPr>
@@ -802,6 +811,7 @@
       <w:r>
         <w:rPr>
           <w:rFonts w:ascii="Times New Roman" w:hAnsi="Times New Roman" w:cs="Times New Roman"/>
+          <w:noProof/>
           <w:sz w:val="28"/>
           <w:szCs w:val="28"/>
         </w:rPr>
@@ -873,7 +883,37 @@
           <w:sz w:val="40"/>
           <w:szCs w:val="40"/>
         </w:rPr>
-        <w:t>Github link:</w:t>
+        <w:t>GitHub</w:t>
+      </w:r>
+      <w:r>
+        <w:rPr>
+          <w:rFonts w:ascii="Times New Roman" w:hAnsi="Times New Roman" w:cs="Times New Roman"/>
+          <w:b/>
+          <w:bCs/>
+          <w:sz w:val="40"/>
+          <w:szCs w:val="40"/>
+        </w:rPr>
+        <w:t xml:space="preserve"> </w:t>
+      </w:r>
+      <w:r>
+        <w:rPr>
+          <w:rFonts w:ascii="Times New Roman" w:hAnsi="Times New Roman" w:cs="Times New Roman"/>
+          <w:b/>
+          <w:bCs/>
+          <w:sz w:val="40"/>
+          <w:szCs w:val="40"/>
+        </w:rPr>
+        <w:t xml:space="preserve">repository </w:t>
+      </w:r>
+      <w:r>
+        <w:rPr>
+          <w:rFonts w:ascii="Times New Roman" w:hAnsi="Times New Roman" w:cs="Times New Roman"/>
+          <w:b/>
+          <w:bCs/>
+          <w:sz w:val="40"/>
+          <w:szCs w:val="40"/>
+        </w:rPr>
+        <w:t>link:</w:t>
       </w:r>
     </w:p>
     <w:p>
@@ -3479,6 +3519,7 @@
   <w:style w:type="character" w:default="1" w:styleId="DefaultParagraphFont">
     <w:name w:val="Default Paragraph Font"/>
     <w:uiPriority w:val="1"/>
+    <w:semiHidden/>
     <w:unhideWhenUsed/>
   </w:style>
   <w:style w:type="table" w:default="1" w:styleId="TableNormal">

</xml_diff>